<commit_message>
docs: agregar evidencias de pruebas del gateway
</commit_message>
<xml_diff>
--- a/Evidencia_Pruebas_Tecnicas/Documento_de_Evidencia_Tarea_Corta_2_Gateways.docx
+++ b/Evidencia_Pruebas_Tecnicas/Documento_de_Evidencia_Tarea_Corta_2_Gateways.docx
@@ -6141,6 +6141,9 @@
           </w:tcPr>
           <w:p>
             <w:r>
+              <w:rPr>
+                <w:noProof/>
+              </w:rPr>
               <w:drawing>
                 <wp:inline distT="0" distB="0" distL="0" distR="0" wp14:anchorId="1268CBC6" wp14:editId="00739278">
                   <wp:extent cx="3408680" cy="1786745"/>
@@ -6280,6 +6283,9 @@
           </w:tcPr>
           <w:p>
             <w:r>
+              <w:rPr>
+                <w:noProof/>
+              </w:rPr>
               <w:drawing>
                 <wp:inline distT="0" distB="0" distL="0" distR="0" wp14:anchorId="3A9B2C92" wp14:editId="0034B0E9">
                   <wp:extent cx="2894330" cy="1517136"/>
@@ -7629,9 +7635,9 @@
         <w:tblLook w:val="04A0" w:firstRow="1" w:lastRow="0" w:firstColumn="1" w:lastColumn="0" w:noHBand="0" w:noVBand="1"/>
       </w:tblPr>
       <w:tblGrid>
-        <w:gridCol w:w="900"/>
-        <w:gridCol w:w="3300"/>
-        <w:gridCol w:w="5438"/>
+        <w:gridCol w:w="654"/>
+        <w:gridCol w:w="1424"/>
+        <w:gridCol w:w="8050"/>
       </w:tblGrid>
       <w:tr>
         <w:trPr>
@@ -7842,7 +7848,54 @@
               <w:right w:w="110" w:type="dxa"/>
             </w:tcMar>
           </w:tcPr>
-          <w:p/>
+          <w:p>
+            <w:r>
+              <w:rPr>
+                <w:noProof/>
+              </w:rPr>
+              <w:drawing>
+                <wp:inline distT="0" distB="0" distL="0" distR="0" wp14:anchorId="1776E6A0" wp14:editId="3432D93F">
+                  <wp:extent cx="4966579" cy="2793507"/>
+                  <wp:effectExtent l="0" t="0" r="5715" b="6985"/>
+                  <wp:docPr id="105500676" name="Imagen 1"/>
+                  <wp:cNvGraphicFramePr>
+                    <a:graphicFrameLocks xmlns:a="http://schemas.openxmlformats.org/drawingml/2006/main" noChangeAspect="1"/>
+                  </wp:cNvGraphicFramePr>
+                  <a:graphic xmlns:a="http://schemas.openxmlformats.org/drawingml/2006/main">
+                    <a:graphicData uri="http://schemas.openxmlformats.org/drawingml/2006/picture">
+                      <pic:pic xmlns:pic="http://schemas.openxmlformats.org/drawingml/2006/picture">
+                        <pic:nvPicPr>
+                          <pic:cNvPr id="105500676" name="Imagen 105500676"/>
+                          <pic:cNvPicPr/>
+                        </pic:nvPicPr>
+                        <pic:blipFill>
+                          <a:blip r:embed="rId36" cstate="print">
+                            <a:extLst>
+                              <a:ext uri="{28A0092B-C50C-407E-A947-70E740481C1C}">
+                                <a14:useLocalDpi xmlns:a14="http://schemas.microsoft.com/office/drawing/2010/main" val="0"/>
+                              </a:ext>
+                            </a:extLst>
+                          </a:blip>
+                          <a:stretch>
+                            <a:fillRect/>
+                          </a:stretch>
+                        </pic:blipFill>
+                        <pic:spPr>
+                          <a:xfrm>
+                            <a:off x="0" y="0"/>
+                            <a:ext cx="4978929" cy="2800453"/>
+                          </a:xfrm>
+                          <a:prstGeom prst="rect">
+                            <a:avLst/>
+                          </a:prstGeom>
+                        </pic:spPr>
+                      </pic:pic>
+                    </a:graphicData>
+                  </a:graphic>
+                </wp:inline>
+              </w:drawing>
+            </w:r>
+          </w:p>
         </w:tc>
       </w:tr>
       <w:tr>
@@ -7927,7 +7980,54 @@
               <w:right w:w="110" w:type="dxa"/>
             </w:tcMar>
           </w:tcPr>
-          <w:p/>
+          <w:p>
+            <w:r>
+              <w:rPr>
+                <w:noProof/>
+              </w:rPr>
+              <w:drawing>
+                <wp:inline distT="0" distB="0" distL="0" distR="0" wp14:anchorId="10759C35" wp14:editId="7F17194F">
+                  <wp:extent cx="4783699" cy="2690645"/>
+                  <wp:effectExtent l="0" t="0" r="0" b="0"/>
+                  <wp:docPr id="1431272038" name="Imagen 2"/>
+                  <wp:cNvGraphicFramePr>
+                    <a:graphicFrameLocks xmlns:a="http://schemas.openxmlformats.org/drawingml/2006/main" noChangeAspect="1"/>
+                  </wp:cNvGraphicFramePr>
+                  <a:graphic xmlns:a="http://schemas.openxmlformats.org/drawingml/2006/main">
+                    <a:graphicData uri="http://schemas.openxmlformats.org/drawingml/2006/picture">
+                      <pic:pic xmlns:pic="http://schemas.openxmlformats.org/drawingml/2006/picture">
+                        <pic:nvPicPr>
+                          <pic:cNvPr id="1431272038" name="Imagen 1431272038"/>
+                          <pic:cNvPicPr/>
+                        </pic:nvPicPr>
+                        <pic:blipFill>
+                          <a:blip r:embed="rId37" cstate="print">
+                            <a:extLst>
+                              <a:ext uri="{28A0092B-C50C-407E-A947-70E740481C1C}">
+                                <a14:useLocalDpi xmlns:a14="http://schemas.microsoft.com/office/drawing/2010/main" val="0"/>
+                              </a:ext>
+                            </a:extLst>
+                          </a:blip>
+                          <a:stretch>
+                            <a:fillRect/>
+                          </a:stretch>
+                        </pic:blipFill>
+                        <pic:spPr>
+                          <a:xfrm>
+                            <a:off x="0" y="0"/>
+                            <a:ext cx="4795311" cy="2697176"/>
+                          </a:xfrm>
+                          <a:prstGeom prst="rect">
+                            <a:avLst/>
+                          </a:prstGeom>
+                        </pic:spPr>
+                      </pic:pic>
+                    </a:graphicData>
+                  </a:graphic>
+                </wp:inline>
+              </w:drawing>
+            </w:r>
+          </w:p>
         </w:tc>
       </w:tr>
     </w:tbl>
@@ -7943,6 +8043,7 @@
         <w:rPr>
           <w:lang w:val="en-US"/>
         </w:rPr>
+        <w:lastRenderedPageBreak/>
         <w:t>GW2 – Routing</w:t>
       </w:r>
       <w:bookmarkEnd w:id="10"/>
@@ -8338,7 +8439,6 @@
         <w:spacing w:before="240"/>
       </w:pPr>
       <w:r>
-        <w:lastRenderedPageBreak/>
         <w:t>Evidencia de ejecución</w:t>
       </w:r>
     </w:p>
@@ -8356,9 +8456,9 @@
         <w:tblLook w:val="04A0" w:firstRow="1" w:lastRow="0" w:firstColumn="1" w:lastColumn="0" w:noHBand="0" w:noVBand="1"/>
       </w:tblPr>
       <w:tblGrid>
-        <w:gridCol w:w="900"/>
-        <w:gridCol w:w="3300"/>
-        <w:gridCol w:w="5438"/>
+        <w:gridCol w:w="654"/>
+        <w:gridCol w:w="1541"/>
+        <w:gridCol w:w="7450"/>
       </w:tblGrid>
       <w:tr>
         <w:trPr>
@@ -8569,7 +8669,54 @@
               <w:right w:w="110" w:type="dxa"/>
             </w:tcMar>
           </w:tcPr>
-          <w:p/>
+          <w:p>
+            <w:r>
+              <w:rPr>
+                <w:noProof/>
+              </w:rPr>
+              <w:drawing>
+                <wp:inline distT="0" distB="0" distL="0" distR="0" wp14:anchorId="1ADF0B7D" wp14:editId="6003711C">
+                  <wp:extent cx="4586751" cy="2579869"/>
+                  <wp:effectExtent l="0" t="0" r="4445" b="0"/>
+                  <wp:docPr id="1071236954" name="Imagen 3"/>
+                  <wp:cNvGraphicFramePr>
+                    <a:graphicFrameLocks xmlns:a="http://schemas.openxmlformats.org/drawingml/2006/main" noChangeAspect="1"/>
+                  </wp:cNvGraphicFramePr>
+                  <a:graphic xmlns:a="http://schemas.openxmlformats.org/drawingml/2006/main">
+                    <a:graphicData uri="http://schemas.openxmlformats.org/drawingml/2006/picture">
+                      <pic:pic xmlns:pic="http://schemas.openxmlformats.org/drawingml/2006/picture">
+                        <pic:nvPicPr>
+                          <pic:cNvPr id="1071236954" name="Imagen 1071236954"/>
+                          <pic:cNvPicPr/>
+                        </pic:nvPicPr>
+                        <pic:blipFill>
+                          <a:blip r:embed="rId38" cstate="print">
+                            <a:extLst>
+                              <a:ext uri="{28A0092B-C50C-407E-A947-70E740481C1C}">
+                                <a14:useLocalDpi xmlns:a14="http://schemas.microsoft.com/office/drawing/2010/main" val="0"/>
+                              </a:ext>
+                            </a:extLst>
+                          </a:blip>
+                          <a:stretch>
+                            <a:fillRect/>
+                          </a:stretch>
+                        </pic:blipFill>
+                        <pic:spPr>
+                          <a:xfrm>
+                            <a:off x="0" y="0"/>
+                            <a:ext cx="4604057" cy="2589603"/>
+                          </a:xfrm>
+                          <a:prstGeom prst="rect">
+                            <a:avLst/>
+                          </a:prstGeom>
+                        </pic:spPr>
+                      </pic:pic>
+                    </a:graphicData>
+                  </a:graphic>
+                </wp:inline>
+              </w:drawing>
+            </w:r>
+          </w:p>
         </w:tc>
       </w:tr>
       <w:tr>
@@ -8654,7 +8801,54 @@
               <w:right w:w="110" w:type="dxa"/>
             </w:tcMar>
           </w:tcPr>
-          <w:p/>
+          <w:p>
+            <w:r>
+              <w:rPr>
+                <w:noProof/>
+              </w:rPr>
+              <w:drawing>
+                <wp:inline distT="0" distB="0" distL="0" distR="0" wp14:anchorId="0D831627" wp14:editId="7269CDA7">
+                  <wp:extent cx="4495311" cy="2528438"/>
+                  <wp:effectExtent l="0" t="0" r="635" b="5715"/>
+                  <wp:docPr id="610802634" name="Imagen 4"/>
+                  <wp:cNvGraphicFramePr>
+                    <a:graphicFrameLocks xmlns:a="http://schemas.openxmlformats.org/drawingml/2006/main" noChangeAspect="1"/>
+                  </wp:cNvGraphicFramePr>
+                  <a:graphic xmlns:a="http://schemas.openxmlformats.org/drawingml/2006/main">
+                    <a:graphicData uri="http://schemas.openxmlformats.org/drawingml/2006/picture">
+                      <pic:pic xmlns:pic="http://schemas.openxmlformats.org/drawingml/2006/picture">
+                        <pic:nvPicPr>
+                          <pic:cNvPr id="610802634" name="Imagen 610802634"/>
+                          <pic:cNvPicPr/>
+                        </pic:nvPicPr>
+                        <pic:blipFill>
+                          <a:blip r:embed="rId39" cstate="print">
+                            <a:extLst>
+                              <a:ext uri="{28A0092B-C50C-407E-A947-70E740481C1C}">
+                                <a14:useLocalDpi xmlns:a14="http://schemas.microsoft.com/office/drawing/2010/main" val="0"/>
+                              </a:ext>
+                            </a:extLst>
+                          </a:blip>
+                          <a:stretch>
+                            <a:fillRect/>
+                          </a:stretch>
+                        </pic:blipFill>
+                        <pic:spPr>
+                          <a:xfrm>
+                            <a:off x="0" y="0"/>
+                            <a:ext cx="4512083" cy="2537872"/>
+                          </a:xfrm>
+                          <a:prstGeom prst="rect">
+                            <a:avLst/>
+                          </a:prstGeom>
+                        </pic:spPr>
+                      </pic:pic>
+                    </a:graphicData>
+                  </a:graphic>
+                </wp:inline>
+              </w:drawing>
+            </w:r>
+          </w:p>
         </w:tc>
       </w:tr>
     </w:tbl>
@@ -8664,6 +8858,7 @@
       </w:pPr>
       <w:bookmarkStart w:id="11" w:name="_Toc12"/>
       <w:r>
+        <w:lastRenderedPageBreak/>
         <w:t>GW3 – Políticas adicionales</w:t>
       </w:r>
       <w:bookmarkEnd w:id="11"/>
@@ -9069,9 +9264,9 @@
         <w:tblLook w:val="04A0" w:firstRow="1" w:lastRow="0" w:firstColumn="1" w:lastColumn="0" w:noHBand="0" w:noVBand="1"/>
       </w:tblPr>
       <w:tblGrid>
-        <w:gridCol w:w="900"/>
-        <w:gridCol w:w="3300"/>
-        <w:gridCol w:w="5438"/>
+        <w:gridCol w:w="654"/>
+        <w:gridCol w:w="1540"/>
+        <w:gridCol w:w="7720"/>
       </w:tblGrid>
       <w:tr>
         <w:trPr>
@@ -9298,7 +9493,54 @@
               <w:right w:w="110" w:type="dxa"/>
             </w:tcMar>
           </w:tcPr>
-          <w:p/>
+          <w:p>
+            <w:r>
+              <w:rPr>
+                <w:noProof/>
+              </w:rPr>
+              <w:drawing>
+                <wp:inline distT="0" distB="0" distL="0" distR="0" wp14:anchorId="6481C07D" wp14:editId="51B6F1DF">
+                  <wp:extent cx="4551582" cy="2560088"/>
+                  <wp:effectExtent l="0" t="0" r="1905" b="0"/>
+                  <wp:docPr id="1365412534" name="Imagen 5"/>
+                  <wp:cNvGraphicFramePr>
+                    <a:graphicFrameLocks xmlns:a="http://schemas.openxmlformats.org/drawingml/2006/main" noChangeAspect="1"/>
+                  </wp:cNvGraphicFramePr>
+                  <a:graphic xmlns:a="http://schemas.openxmlformats.org/drawingml/2006/main">
+                    <a:graphicData uri="http://schemas.openxmlformats.org/drawingml/2006/picture">
+                      <pic:pic xmlns:pic="http://schemas.openxmlformats.org/drawingml/2006/picture">
+                        <pic:nvPicPr>
+                          <pic:cNvPr id="1365412534" name="Imagen 1365412534"/>
+                          <pic:cNvPicPr/>
+                        </pic:nvPicPr>
+                        <pic:blipFill>
+                          <a:blip r:embed="rId40" cstate="print">
+                            <a:extLst>
+                              <a:ext uri="{28A0092B-C50C-407E-A947-70E740481C1C}">
+                                <a14:useLocalDpi xmlns:a14="http://schemas.microsoft.com/office/drawing/2010/main" val="0"/>
+                              </a:ext>
+                            </a:extLst>
+                          </a:blip>
+                          <a:stretch>
+                            <a:fillRect/>
+                          </a:stretch>
+                        </pic:blipFill>
+                        <pic:spPr>
+                          <a:xfrm>
+                            <a:off x="0" y="0"/>
+                            <a:ext cx="4572860" cy="2572056"/>
+                          </a:xfrm>
+                          <a:prstGeom prst="rect">
+                            <a:avLst/>
+                          </a:prstGeom>
+                        </pic:spPr>
+                      </pic:pic>
+                    </a:graphicData>
+                  </a:graphic>
+                </wp:inline>
+              </w:drawing>
+            </w:r>
+          </w:p>
         </w:tc>
       </w:tr>
       <w:tr>
@@ -9334,7 +9576,6 @@
                 <w:sz w:val="19"/>
                 <w:szCs w:val="19"/>
               </w:rPr>
-              <w:lastRenderedPageBreak/>
               <w:t>GW3</w:t>
             </w:r>
           </w:p>
@@ -9400,7 +9641,54 @@
               <w:right w:w="110" w:type="dxa"/>
             </w:tcMar>
           </w:tcPr>
-          <w:p/>
+          <w:p>
+            <w:r>
+              <w:rPr>
+                <w:noProof/>
+              </w:rPr>
+              <w:drawing>
+                <wp:inline distT="0" distB="0" distL="0" distR="0" wp14:anchorId="71AA3805" wp14:editId="7F03D95E">
+                  <wp:extent cx="4481244" cy="2520525"/>
+                  <wp:effectExtent l="0" t="0" r="0" b="0"/>
+                  <wp:docPr id="1629606124" name="Imagen 6"/>
+                  <wp:cNvGraphicFramePr>
+                    <a:graphicFrameLocks xmlns:a="http://schemas.openxmlformats.org/drawingml/2006/main" noChangeAspect="1"/>
+                  </wp:cNvGraphicFramePr>
+                  <a:graphic xmlns:a="http://schemas.openxmlformats.org/drawingml/2006/main">
+                    <a:graphicData uri="http://schemas.openxmlformats.org/drawingml/2006/picture">
+                      <pic:pic xmlns:pic="http://schemas.openxmlformats.org/drawingml/2006/picture">
+                        <pic:nvPicPr>
+                          <pic:cNvPr id="1629606124" name="Imagen 1629606124"/>
+                          <pic:cNvPicPr/>
+                        </pic:nvPicPr>
+                        <pic:blipFill>
+                          <a:blip r:embed="rId41" cstate="print">
+                            <a:extLst>
+                              <a:ext uri="{28A0092B-C50C-407E-A947-70E740481C1C}">
+                                <a14:useLocalDpi xmlns:a14="http://schemas.microsoft.com/office/drawing/2010/main" val="0"/>
+                              </a:ext>
+                            </a:extLst>
+                          </a:blip>
+                          <a:stretch>
+                            <a:fillRect/>
+                          </a:stretch>
+                        </pic:blipFill>
+                        <pic:spPr>
+                          <a:xfrm>
+                            <a:off x="0" y="0"/>
+                            <a:ext cx="4496011" cy="2528831"/>
+                          </a:xfrm>
+                          <a:prstGeom prst="rect">
+                            <a:avLst/>
+                          </a:prstGeom>
+                        </pic:spPr>
+                      </pic:pic>
+                    </a:graphicData>
+                  </a:graphic>
+                </wp:inline>
+              </w:drawing>
+            </w:r>
+          </w:p>
         </w:tc>
       </w:tr>
       <w:tr>
@@ -9436,6 +9724,7 @@
                 <w:sz w:val="19"/>
                 <w:szCs w:val="19"/>
               </w:rPr>
+              <w:lastRenderedPageBreak/>
               <w:t>GW3</w:t>
             </w:r>
           </w:p>
@@ -9501,7 +9790,54 @@
               <w:right w:w="110" w:type="dxa"/>
             </w:tcMar>
           </w:tcPr>
-          <w:p/>
+          <w:p>
+            <w:r>
+              <w:rPr>
+                <w:noProof/>
+              </w:rPr>
+              <w:drawing>
+                <wp:inline distT="0" distB="0" distL="0" distR="0" wp14:anchorId="1F5D264B" wp14:editId="009F6C21">
+                  <wp:extent cx="4762598" cy="2678776"/>
+                  <wp:effectExtent l="0" t="0" r="0" b="7620"/>
+                  <wp:docPr id="44040595" name="Imagen 7"/>
+                  <wp:cNvGraphicFramePr>
+                    <a:graphicFrameLocks xmlns:a="http://schemas.openxmlformats.org/drawingml/2006/main" noChangeAspect="1"/>
+                  </wp:cNvGraphicFramePr>
+                  <a:graphic xmlns:a="http://schemas.openxmlformats.org/drawingml/2006/main">
+                    <a:graphicData uri="http://schemas.openxmlformats.org/drawingml/2006/picture">
+                      <pic:pic xmlns:pic="http://schemas.openxmlformats.org/drawingml/2006/picture">
+                        <pic:nvPicPr>
+                          <pic:cNvPr id="44040595" name="Imagen 44040595"/>
+                          <pic:cNvPicPr/>
+                        </pic:nvPicPr>
+                        <pic:blipFill>
+                          <a:blip r:embed="rId42" cstate="print">
+                            <a:extLst>
+                              <a:ext uri="{28A0092B-C50C-407E-A947-70E740481C1C}">
+                                <a14:useLocalDpi xmlns:a14="http://schemas.microsoft.com/office/drawing/2010/main" val="0"/>
+                              </a:ext>
+                            </a:extLst>
+                          </a:blip>
+                          <a:stretch>
+                            <a:fillRect/>
+                          </a:stretch>
+                        </pic:blipFill>
+                        <pic:spPr>
+                          <a:xfrm>
+                            <a:off x="0" y="0"/>
+                            <a:ext cx="4770594" cy="2683274"/>
+                          </a:xfrm>
+                          <a:prstGeom prst="rect">
+                            <a:avLst/>
+                          </a:prstGeom>
+                        </pic:spPr>
+                      </pic:pic>
+                    </a:graphicData>
+                  </a:graphic>
+                </wp:inline>
+              </w:drawing>
+            </w:r>
+          </w:p>
         </w:tc>
       </w:tr>
       <w:tr>
@@ -9586,7 +9922,54 @@
               <w:right w:w="110" w:type="dxa"/>
             </w:tcMar>
           </w:tcPr>
-          <w:p/>
+          <w:p>
+            <w:r>
+              <w:rPr>
+                <w:noProof/>
+              </w:rPr>
+              <w:drawing>
+                <wp:inline distT="0" distB="0" distL="0" distR="0" wp14:anchorId="49C33C1B" wp14:editId="1DE1F5CD">
+                  <wp:extent cx="4671158" cy="2627345"/>
+                  <wp:effectExtent l="0" t="0" r="0" b="1905"/>
+                  <wp:docPr id="670990141" name="Imagen 8"/>
+                  <wp:cNvGraphicFramePr>
+                    <a:graphicFrameLocks xmlns:a="http://schemas.openxmlformats.org/drawingml/2006/main" noChangeAspect="1"/>
+                  </wp:cNvGraphicFramePr>
+                  <a:graphic xmlns:a="http://schemas.openxmlformats.org/drawingml/2006/main">
+                    <a:graphicData uri="http://schemas.openxmlformats.org/drawingml/2006/picture">
+                      <pic:pic xmlns:pic="http://schemas.openxmlformats.org/drawingml/2006/picture">
+                        <pic:nvPicPr>
+                          <pic:cNvPr id="670990141" name="Imagen 670990141"/>
+                          <pic:cNvPicPr/>
+                        </pic:nvPicPr>
+                        <pic:blipFill>
+                          <a:blip r:embed="rId43" cstate="print">
+                            <a:extLst>
+                              <a:ext uri="{28A0092B-C50C-407E-A947-70E740481C1C}">
+                                <a14:useLocalDpi xmlns:a14="http://schemas.microsoft.com/office/drawing/2010/main" val="0"/>
+                              </a:ext>
+                            </a:extLst>
+                          </a:blip>
+                          <a:stretch>
+                            <a:fillRect/>
+                          </a:stretch>
+                        </pic:blipFill>
+                        <pic:spPr>
+                          <a:xfrm>
+                            <a:off x="0" y="0"/>
+                            <a:ext cx="4678928" cy="2631716"/>
+                          </a:xfrm>
+                          <a:prstGeom prst="rect">
+                            <a:avLst/>
+                          </a:prstGeom>
+                        </pic:spPr>
+                      </pic:pic>
+                    </a:graphicData>
+                  </a:graphic>
+                </wp:inline>
+              </w:drawing>
+            </w:r>
+          </w:p>
         </w:tc>
       </w:tr>
     </w:tbl>
@@ -9900,9 +10283,9 @@
         <w:tblLook w:val="04A0" w:firstRow="1" w:lastRow="0" w:firstColumn="1" w:lastColumn="0" w:noHBand="0" w:noVBand="1"/>
       </w:tblPr>
       <w:tblGrid>
-        <w:gridCol w:w="900"/>
-        <w:gridCol w:w="3300"/>
-        <w:gridCol w:w="5438"/>
+        <w:gridCol w:w="654"/>
+        <w:gridCol w:w="1382"/>
+        <w:gridCol w:w="8050"/>
       </w:tblGrid>
       <w:tr>
         <w:trPr>
@@ -10113,7 +10496,54 @@
               <w:right w:w="110" w:type="dxa"/>
             </w:tcMar>
           </w:tcPr>
-          <w:p/>
+          <w:p>
+            <w:r>
+              <w:rPr>
+                <w:noProof/>
+              </w:rPr>
+              <w:drawing>
+                <wp:inline distT="0" distB="0" distL="0" distR="0" wp14:anchorId="53B5EF68" wp14:editId="26797DF5">
+                  <wp:extent cx="4966579" cy="2793507"/>
+                  <wp:effectExtent l="0" t="0" r="5715" b="6985"/>
+                  <wp:docPr id="1580266008" name="Imagen 9"/>
+                  <wp:cNvGraphicFramePr>
+                    <a:graphicFrameLocks xmlns:a="http://schemas.openxmlformats.org/drawingml/2006/main" noChangeAspect="1"/>
+                  </wp:cNvGraphicFramePr>
+                  <a:graphic xmlns:a="http://schemas.openxmlformats.org/drawingml/2006/main">
+                    <a:graphicData uri="http://schemas.openxmlformats.org/drawingml/2006/picture">
+                      <pic:pic xmlns:pic="http://schemas.openxmlformats.org/drawingml/2006/picture">
+                        <pic:nvPicPr>
+                          <pic:cNvPr id="1580266008" name="Imagen 1580266008"/>
+                          <pic:cNvPicPr/>
+                        </pic:nvPicPr>
+                        <pic:blipFill>
+                          <a:blip r:embed="rId44" cstate="print">
+                            <a:extLst>
+                              <a:ext uri="{28A0092B-C50C-407E-A947-70E740481C1C}">
+                                <a14:useLocalDpi xmlns:a14="http://schemas.microsoft.com/office/drawing/2010/main" val="0"/>
+                              </a:ext>
+                            </a:extLst>
+                          </a:blip>
+                          <a:stretch>
+                            <a:fillRect/>
+                          </a:stretch>
+                        </pic:blipFill>
+                        <pic:spPr>
+                          <a:xfrm>
+                            <a:off x="0" y="0"/>
+                            <a:ext cx="4982730" cy="2802591"/>
+                          </a:xfrm>
+                          <a:prstGeom prst="rect">
+                            <a:avLst/>
+                          </a:prstGeom>
+                        </pic:spPr>
+                      </pic:pic>
+                    </a:graphicData>
+                  </a:graphic>
+                </wp:inline>
+              </w:drawing>
+            </w:r>
+          </w:p>
         </w:tc>
       </w:tr>
       <w:tr>
@@ -10198,7 +10628,54 @@
               <w:right w:w="110" w:type="dxa"/>
             </w:tcMar>
           </w:tcPr>
-          <w:p/>
+          <w:p>
+            <w:r>
+              <w:rPr>
+                <w:noProof/>
+              </w:rPr>
+              <w:drawing>
+                <wp:inline distT="0" distB="0" distL="0" distR="0" wp14:anchorId="617C929E" wp14:editId="3F07BA0E">
+                  <wp:extent cx="4910308" cy="2761857"/>
+                  <wp:effectExtent l="0" t="0" r="5080" b="635"/>
+                  <wp:docPr id="1256452439" name="Imagen 10"/>
+                  <wp:cNvGraphicFramePr>
+                    <a:graphicFrameLocks xmlns:a="http://schemas.openxmlformats.org/drawingml/2006/main" noChangeAspect="1"/>
+                  </wp:cNvGraphicFramePr>
+                  <a:graphic xmlns:a="http://schemas.openxmlformats.org/drawingml/2006/main">
+                    <a:graphicData uri="http://schemas.openxmlformats.org/drawingml/2006/picture">
+                      <pic:pic xmlns:pic="http://schemas.openxmlformats.org/drawingml/2006/picture">
+                        <pic:nvPicPr>
+                          <pic:cNvPr id="1256452439" name="Imagen 1256452439"/>
+                          <pic:cNvPicPr/>
+                        </pic:nvPicPr>
+                        <pic:blipFill>
+                          <a:blip r:embed="rId45" cstate="print">
+                            <a:extLst>
+                              <a:ext uri="{28A0092B-C50C-407E-A947-70E740481C1C}">
+                                <a14:useLocalDpi xmlns:a14="http://schemas.microsoft.com/office/drawing/2010/main" val="0"/>
+                              </a:ext>
+                            </a:extLst>
+                          </a:blip>
+                          <a:stretch>
+                            <a:fillRect/>
+                          </a:stretch>
+                        </pic:blipFill>
+                        <pic:spPr>
+                          <a:xfrm>
+                            <a:off x="0" y="0"/>
+                            <a:ext cx="4921451" cy="2768125"/>
+                          </a:xfrm>
+                          <a:prstGeom prst="rect">
+                            <a:avLst/>
+                          </a:prstGeom>
+                        </pic:spPr>
+                      </pic:pic>
+                    </a:graphicData>
+                  </a:graphic>
+                </wp:inline>
+              </w:drawing>
+            </w:r>
+          </w:p>
         </w:tc>
       </w:tr>
       <w:tr>
@@ -10283,7 +10760,54 @@
               <w:right w:w="110" w:type="dxa"/>
             </w:tcMar>
           </w:tcPr>
-          <w:p/>
+          <w:p>
+            <w:r>
+              <w:rPr>
+                <w:noProof/>
+              </w:rPr>
+              <w:drawing>
+                <wp:inline distT="0" distB="0" distL="0" distR="0" wp14:anchorId="42447880" wp14:editId="1A9E1E93">
+                  <wp:extent cx="4889207" cy="2749989"/>
+                  <wp:effectExtent l="0" t="0" r="6985" b="0"/>
+                  <wp:docPr id="170079058" name="Imagen 11"/>
+                  <wp:cNvGraphicFramePr>
+                    <a:graphicFrameLocks xmlns:a="http://schemas.openxmlformats.org/drawingml/2006/main" noChangeAspect="1"/>
+                  </wp:cNvGraphicFramePr>
+                  <a:graphic xmlns:a="http://schemas.openxmlformats.org/drawingml/2006/main">
+                    <a:graphicData uri="http://schemas.openxmlformats.org/drawingml/2006/picture">
+                      <pic:pic xmlns:pic="http://schemas.openxmlformats.org/drawingml/2006/picture">
+                        <pic:nvPicPr>
+                          <pic:cNvPr id="170079058" name="Imagen 170079058"/>
+                          <pic:cNvPicPr/>
+                        </pic:nvPicPr>
+                        <pic:blipFill>
+                          <a:blip r:embed="rId46" cstate="print">
+                            <a:extLst>
+                              <a:ext uri="{28A0092B-C50C-407E-A947-70E740481C1C}">
+                                <a14:useLocalDpi xmlns:a14="http://schemas.microsoft.com/office/drawing/2010/main" val="0"/>
+                              </a:ext>
+                            </a:extLst>
+                          </a:blip>
+                          <a:stretch>
+                            <a:fillRect/>
+                          </a:stretch>
+                        </pic:blipFill>
+                        <pic:spPr>
+                          <a:xfrm>
+                            <a:off x="0" y="0"/>
+                            <a:ext cx="4898310" cy="2755109"/>
+                          </a:xfrm>
+                          <a:prstGeom prst="rect">
+                            <a:avLst/>
+                          </a:prstGeom>
+                        </pic:spPr>
+                      </pic:pic>
+                    </a:graphicData>
+                  </a:graphic>
+                </wp:inline>
+              </w:drawing>
+            </w:r>
+          </w:p>
         </w:tc>
       </w:tr>
       <w:tr>
@@ -10319,6 +10843,7 @@
                 <w:sz w:val="19"/>
                 <w:szCs w:val="19"/>
               </w:rPr>
+              <w:lastRenderedPageBreak/>
               <w:t>GW4</w:t>
             </w:r>
           </w:p>
@@ -10384,7 +10909,54 @@
               <w:right w:w="110" w:type="dxa"/>
             </w:tcMar>
           </w:tcPr>
-          <w:p/>
+          <w:p>
+            <w:r>
+              <w:rPr>
+                <w:noProof/>
+              </w:rPr>
+              <w:drawing>
+                <wp:inline distT="0" distB="0" distL="0" distR="0" wp14:anchorId="3E0563FB" wp14:editId="279F0561">
+                  <wp:extent cx="4896240" cy="2753944"/>
+                  <wp:effectExtent l="0" t="0" r="0" b="8890"/>
+                  <wp:docPr id="106439985" name="Imagen 12"/>
+                  <wp:cNvGraphicFramePr>
+                    <a:graphicFrameLocks xmlns:a="http://schemas.openxmlformats.org/drawingml/2006/main" noChangeAspect="1"/>
+                  </wp:cNvGraphicFramePr>
+                  <a:graphic xmlns:a="http://schemas.openxmlformats.org/drawingml/2006/main">
+                    <a:graphicData uri="http://schemas.openxmlformats.org/drawingml/2006/picture">
+                      <pic:pic xmlns:pic="http://schemas.openxmlformats.org/drawingml/2006/picture">
+                        <pic:nvPicPr>
+                          <pic:cNvPr id="106439985" name="Imagen 106439985"/>
+                          <pic:cNvPicPr/>
+                        </pic:nvPicPr>
+                        <pic:blipFill>
+                          <a:blip r:embed="rId47" cstate="print">
+                            <a:extLst>
+                              <a:ext uri="{28A0092B-C50C-407E-A947-70E740481C1C}">
+                                <a14:useLocalDpi xmlns:a14="http://schemas.microsoft.com/office/drawing/2010/main" val="0"/>
+                              </a:ext>
+                            </a:extLst>
+                          </a:blip>
+                          <a:stretch>
+                            <a:fillRect/>
+                          </a:stretch>
+                        </pic:blipFill>
+                        <pic:spPr>
+                          <a:xfrm>
+                            <a:off x="0" y="0"/>
+                            <a:ext cx="4908780" cy="2760997"/>
+                          </a:xfrm>
+                          <a:prstGeom prst="rect">
+                            <a:avLst/>
+                          </a:prstGeom>
+                        </pic:spPr>
+                      </pic:pic>
+                    </a:graphicData>
+                  </a:graphic>
+                </wp:inline>
+              </w:drawing>
+            </w:r>
+          </w:p>
         </w:tc>
       </w:tr>
     </w:tbl>
@@ -10428,8 +11000,8 @@
       </w:r>
     </w:p>
     <w:sectPr>
-      <w:footerReference w:type="default" r:id="rId36"/>
-      <w:footerReference w:type="first" r:id="rId37"/>
+      <w:footerReference w:type="default" r:id="rId48"/>
+      <w:footerReference w:type="first" r:id="rId49"/>
       <w:pgSz w:w="11906" w:h="16838"/>
       <w:pgMar w:top="1134" w:right="1134" w:bottom="1134" w:left="1134" w:header="708" w:footer="567" w:gutter="0"/>
       <w:cols w:space="1701"/>
@@ -11252,6 +11824,7 @@
   <w:style w:type="character" w:default="1" w:styleId="Fuentedeprrafopredeter">
     <w:name w:val="Default Paragraph Font"/>
     <w:uiPriority w:val="1"/>
+    <w:semiHidden/>
     <w:unhideWhenUsed/>
   </w:style>
   <w:style w:type="table" w:default="1" w:styleId="Tablanormal">

</xml_diff>